<commit_message>
Word a proxy server
</commit_message>
<xml_diff>
--- a/Rocnikova_prace_Prokes.docx
+++ b/Rocnikova_prace_Prokes.docx
@@ -1829,14 +1829,7 @@
           <w:rFonts w:ascii="Times New Roman" w:hAnsi="Times New Roman"/>
           <w:sz w:val="24"/>
         </w:rPr>
-        <w:t>, duplicitní soubory v projektu nebo nutnost rozdělit původní konzolovou aplikaci na více částí. Výsledkem je funkční základ apl</w:t>
-      </w:r>
-      <w:r>
-        <w:rPr>
-          <w:rFonts w:ascii="Times New Roman" w:hAnsi="Times New Roman"/>
-          <w:sz w:val="24"/>
-        </w:rPr>
-        <w:t xml:space="preserve">ikace, která může sloužit jako nadstavba nad systémem </w:t>
+        <w:t xml:space="preserve">, duplicitní soubory v projektu nebo nutnost rozdělit původní konzolovou aplikaci na více částí. Výsledkem je funkční základ aplikace, která může sloužit jako nadstavba nad systémem </w:t>
       </w:r>
       <w:proofErr w:type="spellStart"/>
       <w:r>
@@ -5130,32 +5123,66 @@
     <w:p>
       <w:pPr>
         <w:jc w:val="center"/>
-      </w:pPr>
-      <w:r>
         <w:rPr>
           <w:rFonts w:ascii="Times New Roman" w:hAnsi="Times New Roman"/>
           <w:i/>
           <w:sz w:val="24"/>
         </w:rPr>
-        <w:t xml:space="preserve">Obr. 1 - Ukázka jednoduchého schématu chytré domácnosti. Na obrázku by měl být </w:t>
-      </w:r>
-      <w:proofErr w:type="spellStart"/>
+      </w:pPr>
       <w:r>
         <w:rPr>
           <w:rFonts w:ascii="Times New Roman" w:hAnsi="Times New Roman"/>
           <w:i/>
           <w:sz w:val="24"/>
         </w:rPr>
-        <w:t>Miniserver</w:t>
-      </w:r>
-      <w:proofErr w:type="spellEnd"/>
+        <w:t>Obr. 1 - Ukázka jednoduchého schématu chytré domácnosti</w:t>
+      </w:r>
+    </w:p>
+    <w:p>
+      <w:pPr>
+        <w:jc w:val="center"/>
+      </w:pPr>
       <w:r>
         <w:rPr>
           <w:rFonts w:ascii="Times New Roman" w:hAnsi="Times New Roman"/>
           <w:i/>
           <w:sz w:val="24"/>
         </w:rPr>
-        <w:t xml:space="preserve"> uprostřed a kolem něj světlo, senzor teploty, tlačítko a počítač s aplikací.</w:t>
+        <w:drawing>
+          <wp:inline distT="0" distB="0" distL="0" distR="0" wp14:anchorId="172976BD" wp14:editId="6E421A2C">
+            <wp:extent cx="6188710" cy="2071370"/>
+            <wp:effectExtent l="0" t="0" r="2540" b="5080"/>
+            <wp:docPr id="1228385918" name="Obrázek 1"/>
+            <wp:cNvGraphicFramePr>
+              <a:graphicFrameLocks xmlns:a="http://schemas.openxmlformats.org/drawingml/2006/main" noChangeAspect="1"/>
+            </wp:cNvGraphicFramePr>
+            <a:graphic xmlns:a="http://schemas.openxmlformats.org/drawingml/2006/main">
+              <a:graphicData uri="http://schemas.openxmlformats.org/drawingml/2006/picture">
+                <pic:pic xmlns:pic="http://schemas.openxmlformats.org/drawingml/2006/picture">
+                  <pic:nvPicPr>
+                    <pic:cNvPr id="1228385918" name=""/>
+                    <pic:cNvPicPr/>
+                  </pic:nvPicPr>
+                  <pic:blipFill>
+                    <a:blip r:embed="rId14"/>
+                    <a:stretch>
+                      <a:fillRect/>
+                    </a:stretch>
+                  </pic:blipFill>
+                  <pic:spPr>
+                    <a:xfrm>
+                      <a:off x="0" y="0"/>
+                      <a:ext cx="6188710" cy="2071370"/>
+                    </a:xfrm>
+                    <a:prstGeom prst="rect">
+                      <a:avLst/>
+                    </a:prstGeom>
+                  </pic:spPr>
+                </pic:pic>
+              </a:graphicData>
+            </a:graphic>
+          </wp:inline>
+        </w:drawing>
       </w:r>
     </w:p>
     <w:p>
@@ -5167,6 +5194,7 @@
         <w:rPr>
           <w:rFonts w:eastAsia="Times New Roman"/>
         </w:rPr>
+        <w:lastRenderedPageBreak/>
         <w:t xml:space="preserve">Systém </w:t>
       </w:r>
       <w:proofErr w:type="spellStart"/>
@@ -5275,15 +5303,7 @@
           <w:rFonts w:ascii="Times New Roman" w:hAnsi="Times New Roman"/>
           <w:sz w:val="24"/>
         </w:rPr>
-        <w:t xml:space="preserve">. V tomto projektu se toho využilo pro ovládání světla a později pro čtení </w:t>
-      </w:r>
-      <w:r>
-        <w:rPr>
-          <w:rFonts w:ascii="Times New Roman" w:hAnsi="Times New Roman"/>
-          <w:sz w:val="24"/>
-        </w:rPr>
-        <w:lastRenderedPageBreak/>
-        <w:t xml:space="preserve">hodnoty teploty z prvku </w:t>
+        <w:t xml:space="preserve">. V tomto projektu se toho využilo pro ovládání světla a později pro čtení hodnoty teploty z prvku </w:t>
       </w:r>
       <w:proofErr w:type="spellStart"/>
       <w:r>
@@ -5334,6 +5354,7 @@
         <w:t xml:space="preserve"> uvádí samostatnou část věnovanou API, portům a doménám </w:t>
       </w:r>
       <w:proofErr w:type="spellStart"/>
+      <w:proofErr w:type="gramStart"/>
       <w:r>
         <w:rPr>
           <w:rFonts w:ascii="Times New Roman" w:hAnsi="Times New Roman"/>
@@ -5347,8 +5368,9 @@
           <w:rFonts w:ascii="Times New Roman" w:hAnsi="Times New Roman"/>
           <w:sz w:val="24"/>
         </w:rPr>
-        <w:t xml:space="preserve"> [1].</w:t>
-      </w:r>
+        <w:t xml:space="preserve"> .</w:t>
+      </w:r>
+      <w:proofErr w:type="gramEnd"/>
     </w:p>
     <w:p>
       <w:pPr>
@@ -5481,13 +5503,18 @@
     <w:p>
       <w:pPr>
         <w:jc w:val="center"/>
-      </w:pPr>
-      <w:r>
         <w:rPr>
           <w:rFonts w:ascii="Times New Roman" w:hAnsi="Times New Roman"/>
           <w:i/>
           <w:sz w:val="24"/>
         </w:rPr>
+      </w:pPr>
+      <w:r>
+        <w:rPr>
+          <w:rFonts w:ascii="Times New Roman" w:hAnsi="Times New Roman"/>
+          <w:i/>
+          <w:sz w:val="24"/>
+        </w:rPr>
         <w:t xml:space="preserve">Obr. 2 - Fotografie nebo screenshot </w:t>
       </w:r>
       <w:proofErr w:type="spellStart"/>
@@ -5524,7 +5551,70 @@
           <w:i/>
           <w:sz w:val="24"/>
         </w:rPr>
-        <w:t xml:space="preserve"> použitého v projektu. Vhodné je doplnit popisek s tím, že se jedná o centrální jednotku, se kterou aplikace komunikuje.</w:t>
+        <w:t xml:space="preserve"> použitého v</w:t>
+      </w:r>
+      <w:r>
+        <w:rPr>
+          <w:rFonts w:ascii="Times New Roman" w:hAnsi="Times New Roman"/>
+          <w:i/>
+          <w:sz w:val="24"/>
+        </w:rPr>
+        <w:t> </w:t>
+      </w:r>
+      <w:r>
+        <w:rPr>
+          <w:rFonts w:ascii="Times New Roman" w:hAnsi="Times New Roman"/>
+          <w:i/>
+          <w:sz w:val="24"/>
+        </w:rPr>
+        <w:t>projektu</w:t>
+      </w:r>
+    </w:p>
+    <w:p>
+      <w:pPr>
+        <w:jc w:val="center"/>
+      </w:pPr>
+      <w:r>
+        <w:rPr>
+          <w:rFonts w:ascii="Times New Roman" w:hAnsi="Times New Roman"/>
+          <w:i/>
+          <w:sz w:val="24"/>
+        </w:rPr>
+        <w:drawing>
+          <wp:inline distT="0" distB="0" distL="0" distR="0" wp14:anchorId="5B6EA37F" wp14:editId="10424C4B">
+            <wp:extent cx="4876800" cy="3530251"/>
+            <wp:effectExtent l="0" t="0" r="0" b="0"/>
+            <wp:docPr id="445221712" name="Obrázek 1"/>
+            <wp:cNvGraphicFramePr>
+              <a:graphicFrameLocks xmlns:a="http://schemas.openxmlformats.org/drawingml/2006/main" noChangeAspect="1"/>
+            </wp:cNvGraphicFramePr>
+            <a:graphic xmlns:a="http://schemas.openxmlformats.org/drawingml/2006/main">
+              <a:graphicData uri="http://schemas.openxmlformats.org/drawingml/2006/picture">
+                <pic:pic xmlns:pic="http://schemas.openxmlformats.org/drawingml/2006/picture">
+                  <pic:nvPicPr>
+                    <pic:cNvPr id="445221712" name=""/>
+                    <pic:cNvPicPr/>
+                  </pic:nvPicPr>
+                  <pic:blipFill>
+                    <a:blip r:embed="rId15"/>
+                    <a:stretch>
+                      <a:fillRect/>
+                    </a:stretch>
+                  </pic:blipFill>
+                  <pic:spPr>
+                    <a:xfrm>
+                      <a:off x="0" y="0"/>
+                      <a:ext cx="4890193" cy="3539946"/>
+                    </a:xfrm>
+                    <a:prstGeom prst="rect">
+                      <a:avLst/>
+                    </a:prstGeom>
+                  </pic:spPr>
+                </pic:pic>
+              </a:graphicData>
+            </a:graphic>
+          </wp:inline>
+        </w:drawing>
       </w:r>
     </w:p>
     <w:p>
@@ -5536,6 +5626,7 @@
         <w:rPr>
           <w:rFonts w:eastAsia="Times New Roman"/>
         </w:rPr>
+        <w:lastRenderedPageBreak/>
         <w:t xml:space="preserve">Propojení zařízení v systému </w:t>
       </w:r>
       <w:proofErr w:type="spellStart"/>
@@ -5803,7 +5894,7 @@
           <w:rFonts w:ascii="Times New Roman" w:hAnsi="Times New Roman"/>
           <w:sz w:val="24"/>
         </w:rPr>
-        <w:t xml:space="preserve"> existuje popis API rozhraní, který je určený právě pro integraci a vlastní aplikace [1].</w:t>
+        <w:t xml:space="preserve"> existuje popis API rozhraní, který je určený právě pro integraci a vlastní aplikace.</w:t>
       </w:r>
     </w:p>
     <w:p>
@@ -5946,15 +6037,7 @@
           <w:rFonts w:ascii="Times New Roman" w:hAnsi="Times New Roman"/>
           <w:sz w:val="24"/>
         </w:rPr>
-        <w:t xml:space="preserve"> příkaz nepřijal. </w:t>
-      </w:r>
-      <w:r>
-        <w:rPr>
-          <w:rFonts w:ascii="Times New Roman" w:hAnsi="Times New Roman"/>
-          <w:sz w:val="24"/>
-        </w:rPr>
-        <w:lastRenderedPageBreak/>
-        <w:t xml:space="preserve">Dokumentace </w:t>
+        <w:t xml:space="preserve"> příkaz nepřijal. Dokumentace </w:t>
       </w:r>
       <w:proofErr w:type="spellStart"/>
       <w:r>
@@ -6002,8 +6085,17 @@
           <w:rFonts w:ascii="Times New Roman" w:hAnsi="Times New Roman"/>
           <w:sz w:val="24"/>
         </w:rPr>
-        <w:t xml:space="preserve"> pomocí webových služeb a uvádí příklady příkazů pro zařízení [2].</w:t>
-      </w:r>
+        <w:t xml:space="preserve"> pomocí webových služeb a uvádí příklady příkazů pro </w:t>
+      </w:r>
+      <w:proofErr w:type="gramStart"/>
+      <w:r>
+        <w:rPr>
+          <w:rFonts w:ascii="Times New Roman" w:hAnsi="Times New Roman"/>
+          <w:sz w:val="24"/>
+        </w:rPr>
+        <w:t>zařízení .</w:t>
+      </w:r>
+      <w:proofErr w:type="gramEnd"/>
     </w:p>
     <w:p>
       <w:pPr>
@@ -6169,14 +6261,70 @@
     <w:p>
       <w:pPr>
         <w:jc w:val="center"/>
-      </w:pPr>
-      <w:r>
         <w:rPr>
           <w:rFonts w:ascii="Times New Roman" w:hAnsi="Times New Roman"/>
           <w:i/>
           <w:sz w:val="24"/>
         </w:rPr>
-        <w:t>Obr. 3 - Screenshot části souboru LoxAPP3.json se světlem a teplotou. Na obrázku by mělo být vidět UUID světelného regulátoru a UUID teplotního prvku.</w:t>
+      </w:pPr>
+      <w:r>
+        <w:rPr>
+          <w:rFonts w:ascii="Times New Roman" w:hAnsi="Times New Roman"/>
+          <w:i/>
+          <w:sz w:val="24"/>
+        </w:rPr>
+        <w:t>Obr. 3 - Screenshot části souboru LoxAPP3.json se světlem a teplotou</w:t>
+      </w:r>
+      <w:r>
+        <w:rPr>
+          <w:rFonts w:ascii="Times New Roman" w:hAnsi="Times New Roman"/>
+          <w:i/>
+          <w:sz w:val="24"/>
+        </w:rPr>
+        <w:t>.</w:t>
+      </w:r>
+    </w:p>
+    <w:p>
+      <w:pPr>
+        <w:jc w:val="center"/>
+      </w:pPr>
+      <w:r>
+        <w:lastRenderedPageBreak/>
+        <w:drawing>
+          <wp:inline distT="0" distB="0" distL="0" distR="0" wp14:anchorId="03054D54" wp14:editId="75F780BB">
+            <wp:extent cx="6188710" cy="3078480"/>
+            <wp:effectExtent l="0" t="0" r="2540" b="7620"/>
+            <wp:docPr id="841701568" name="Obrázek 1"/>
+            <wp:cNvGraphicFramePr>
+              <a:graphicFrameLocks xmlns:a="http://schemas.openxmlformats.org/drawingml/2006/main" noChangeAspect="1"/>
+            </wp:cNvGraphicFramePr>
+            <a:graphic xmlns:a="http://schemas.openxmlformats.org/drawingml/2006/main">
+              <a:graphicData uri="http://schemas.openxmlformats.org/drawingml/2006/picture">
+                <pic:pic xmlns:pic="http://schemas.openxmlformats.org/drawingml/2006/picture">
+                  <pic:nvPicPr>
+                    <pic:cNvPr id="841701568" name=""/>
+                    <pic:cNvPicPr/>
+                  </pic:nvPicPr>
+                  <pic:blipFill>
+                    <a:blip r:embed="rId16"/>
+                    <a:stretch>
+                      <a:fillRect/>
+                    </a:stretch>
+                  </pic:blipFill>
+                  <pic:spPr>
+                    <a:xfrm>
+                      <a:off x="0" y="0"/>
+                      <a:ext cx="6188710" cy="3078480"/>
+                    </a:xfrm>
+                    <a:prstGeom prst="rect">
+                      <a:avLst/>
+                    </a:prstGeom>
+                  </pic:spPr>
+                </pic:pic>
+              </a:graphicData>
+            </a:graphic>
+          </wp:inline>
+        </w:drawing>
       </w:r>
     </w:p>
     <w:p>
@@ -6279,7 +6427,7 @@
           <w:rFonts w:ascii="Times New Roman" w:hAnsi="Times New Roman"/>
           <w:sz w:val="24"/>
         </w:rPr>
-        <w:t xml:space="preserve"> jako nástroj pro odesílání HTTP požadavků a zpracování odpovědí [3].</w:t>
+        <w:t xml:space="preserve"> jako nástroj pro odesílání HTTP požadavků a zpracování odpovědí.</w:t>
       </w:r>
     </w:p>
     <w:p>
@@ -6324,14 +6472,7 @@
           <w:rFonts w:ascii="Times New Roman" w:hAnsi="Times New Roman"/>
           <w:sz w:val="24"/>
         </w:rPr>
-        <w:t>H</w:t>
-      </w:r>
-      <w:r>
-        <w:rPr>
-          <w:rFonts w:ascii="Times New Roman" w:hAnsi="Times New Roman"/>
-          <w:sz w:val="24"/>
-        </w:rPr>
-        <w:t>ttpClient</w:t>
+        <w:t>HttpClient</w:t>
       </w:r>
       <w:proofErr w:type="spellEnd"/>
       <w:r>
@@ -6416,7 +6557,7 @@
           <w:rFonts w:ascii="Times New Roman" w:hAnsi="Times New Roman"/>
           <w:sz w:val="24"/>
         </w:rPr>
-        <w:t xml:space="preserve"> uvádí, že požadavky je možné provádět a odpovědi zpracovávat asynchronně [4].</w:t>
+        <w:t xml:space="preserve"> uvádí, že požadavky je možné provádět a odpovědi zpracovávat asynchronně.</w:t>
       </w:r>
     </w:p>
     <w:p>
@@ -6509,7 +6650,15 @@
           <w:rFonts w:ascii="Times New Roman" w:hAnsi="Times New Roman"/>
           <w:sz w:val="24"/>
         </w:rPr>
-        <w:t>, která znamenala, že server požadavek odmítl kvůli chybějícímu nebo špatnému ověření. Tato chyba byla důležitá, protože ukázala rozdíl mezi problémem s připojením a problémem s přihlášením.</w:t>
+        <w:t xml:space="preserve">, která znamenala, že server </w:t>
+      </w:r>
+      <w:r>
+        <w:rPr>
+          <w:rFonts w:ascii="Times New Roman" w:hAnsi="Times New Roman"/>
+          <w:sz w:val="24"/>
+        </w:rPr>
+        <w:lastRenderedPageBreak/>
+        <w:t>požadavek odmítl kvůli chybějícímu nebo špatnému ověření. Tato chyba byla důležitá, protože ukázala rozdíl mezi problémem s připojením a problémem s přihlášením.</w:t>
       </w:r>
     </w:p>
     <w:p>
@@ -6522,7 +6671,6 @@
           <w:rFonts w:ascii="Times New Roman" w:hAnsi="Times New Roman"/>
           <w:sz w:val="24"/>
         </w:rPr>
-        <w:lastRenderedPageBreak/>
         <w:t>Do výsledné práce ani do ukázek není vhodné vkládat skutečné heslo. V textu práce se proto používá zástupný text pro heslo a v kódu pro odevzdání by bylo lepší přihlašovací údaje přesunout do konfiguračního souboru nebo proměnných prostředí.</w:t>
       </w:r>
     </w:p>
@@ -6831,167 +6979,8 @@
           <w:rFonts w:ascii="Times New Roman" w:hAnsi="Times New Roman"/>
           <w:sz w:val="24"/>
         </w:rPr>
-        <w:t xml:space="preserve"> zároveň ve své dokumentaci popisuje přístup přes internet a služby pro vzdálený přístup [6].</w:t>
-      </w:r>
-    </w:p>
-    <w:p>
-      <w:pPr>
-        <w:jc w:val="center"/>
-      </w:pPr>
-      <w:r>
-        <w:rPr>
-          <w:rFonts w:ascii="Times New Roman" w:hAnsi="Times New Roman"/>
-          <w:i/>
-          <w:sz w:val="24"/>
-        </w:rPr>
-        <w:t xml:space="preserve">Obr. 4 - Schéma navržené architektury. Na obrázku by měly být čtyři části: uživatel, </w:t>
-      </w:r>
-      <w:proofErr w:type="spellStart"/>
-      <w:r>
-        <w:rPr>
-          <w:rFonts w:ascii="Times New Roman" w:hAnsi="Times New Roman"/>
-          <w:i/>
-          <w:sz w:val="24"/>
-        </w:rPr>
-        <w:t>proxy</w:t>
-      </w:r>
-      <w:proofErr w:type="spellEnd"/>
-      <w:r>
-        <w:rPr>
-          <w:rFonts w:ascii="Times New Roman" w:hAnsi="Times New Roman"/>
-          <w:i/>
-          <w:sz w:val="24"/>
-        </w:rPr>
-        <w:t xml:space="preserve"> server, </w:t>
-      </w:r>
-      <w:proofErr w:type="spellStart"/>
-      <w:r>
-        <w:rPr>
-          <w:rFonts w:ascii="Times New Roman" w:hAnsi="Times New Roman"/>
-          <w:i/>
-          <w:sz w:val="24"/>
-        </w:rPr>
-        <w:t>backend</w:t>
-      </w:r>
-      <w:proofErr w:type="spellEnd"/>
-      <w:r>
-        <w:rPr>
-          <w:rFonts w:ascii="Times New Roman" w:hAnsi="Times New Roman"/>
-          <w:i/>
-          <w:sz w:val="24"/>
-        </w:rPr>
-        <w:t xml:space="preserve"> a </w:t>
-      </w:r>
-      <w:proofErr w:type="spellStart"/>
-      <w:r>
-        <w:rPr>
-          <w:rFonts w:ascii="Times New Roman" w:hAnsi="Times New Roman"/>
-          <w:i/>
-          <w:sz w:val="24"/>
-        </w:rPr>
-        <w:t>Loxone</w:t>
-      </w:r>
-      <w:proofErr w:type="spellEnd"/>
-      <w:r>
-        <w:rPr>
-          <w:rFonts w:ascii="Times New Roman" w:hAnsi="Times New Roman"/>
-          <w:i/>
-          <w:sz w:val="24"/>
-        </w:rPr>
-        <w:t xml:space="preserve"> </w:t>
-      </w:r>
-      <w:proofErr w:type="spellStart"/>
-      <w:r>
-        <w:rPr>
-          <w:rFonts w:ascii="Times New Roman" w:hAnsi="Times New Roman"/>
-          <w:i/>
-          <w:sz w:val="24"/>
-        </w:rPr>
-        <w:t>Miniserver</w:t>
-      </w:r>
-      <w:proofErr w:type="spellEnd"/>
-      <w:r>
-        <w:rPr>
-          <w:rFonts w:ascii="Times New Roman" w:hAnsi="Times New Roman"/>
-          <w:i/>
-          <w:sz w:val="24"/>
-        </w:rPr>
-        <w:t xml:space="preserve">. Popis má ukazovat, že </w:t>
-      </w:r>
-      <w:proofErr w:type="spellStart"/>
-      <w:r>
-        <w:rPr>
-          <w:rFonts w:ascii="Times New Roman" w:hAnsi="Times New Roman"/>
-          <w:i/>
-          <w:sz w:val="24"/>
-        </w:rPr>
-        <w:t>proxy</w:t>
-      </w:r>
-      <w:proofErr w:type="spellEnd"/>
-      <w:r>
-        <w:rPr>
-          <w:rFonts w:ascii="Times New Roman" w:hAnsi="Times New Roman"/>
-          <w:i/>
-          <w:sz w:val="24"/>
-        </w:rPr>
-        <w:t xml:space="preserve"> předává požadavky na </w:t>
-      </w:r>
-      <w:proofErr w:type="spellStart"/>
-      <w:r>
-        <w:rPr>
-          <w:rFonts w:ascii="Times New Roman" w:hAnsi="Times New Roman"/>
-          <w:i/>
-          <w:sz w:val="24"/>
-        </w:rPr>
-        <w:t>backend</w:t>
-      </w:r>
-      <w:proofErr w:type="spellEnd"/>
-      <w:r>
-        <w:rPr>
-          <w:rFonts w:ascii="Times New Roman" w:hAnsi="Times New Roman"/>
-          <w:i/>
-          <w:sz w:val="24"/>
-        </w:rPr>
-        <w:t xml:space="preserve"> a </w:t>
-      </w:r>
-      <w:proofErr w:type="spellStart"/>
-      <w:r>
-        <w:rPr>
-          <w:rFonts w:ascii="Times New Roman" w:hAnsi="Times New Roman"/>
-          <w:i/>
-          <w:sz w:val="24"/>
-        </w:rPr>
-        <w:t>backend</w:t>
-      </w:r>
-      <w:proofErr w:type="spellEnd"/>
-      <w:r>
-        <w:rPr>
-          <w:rFonts w:ascii="Times New Roman" w:hAnsi="Times New Roman"/>
-          <w:i/>
-          <w:sz w:val="24"/>
-        </w:rPr>
-        <w:t xml:space="preserve"> komunikuje s </w:t>
-      </w:r>
-      <w:proofErr w:type="spellStart"/>
-      <w:r>
-        <w:rPr>
-          <w:rFonts w:ascii="Times New Roman" w:hAnsi="Times New Roman"/>
-          <w:i/>
-          <w:sz w:val="24"/>
-        </w:rPr>
-        <w:t>Miniserverem</w:t>
-      </w:r>
-      <w:proofErr w:type="spellEnd"/>
-      <w:r>
-        <w:rPr>
-          <w:rFonts w:ascii="Times New Roman" w:hAnsi="Times New Roman"/>
-          <w:i/>
-          <w:sz w:val="24"/>
-        </w:rPr>
-        <w:t>.</w:t>
-      </w:r>
-    </w:p>
-    <w:p>
+        <w:t xml:space="preserve"> zároveň ve své dokumentaci popisuje přístup přes internet a služby pro vzdálený přístup.</w:t>
+      </w:r>
       <w:r>
         <w:rPr>
           <w:rFonts w:ascii="Times New Roman" w:hAnsi="Times New Roman"/>
@@ -7067,14 +7056,7 @@
           <w:rFonts w:ascii="Times New Roman" w:hAnsi="Times New Roman"/>
           <w:sz w:val="24"/>
         </w:rPr>
-        <w:t>P</w:t>
-      </w:r>
-      <w:r>
-        <w:rPr>
-          <w:rFonts w:ascii="Times New Roman" w:hAnsi="Times New Roman"/>
-          <w:sz w:val="24"/>
-        </w:rPr>
-        <w:t xml:space="preserve">raktická část začala jednoduchým cílem: odeslat z C# programu příkaz do </w:t>
+        <w:t xml:space="preserve">Praktická část začala jednoduchým cílem: odeslat z C# programu příkaz do </w:t>
       </w:r>
       <w:proofErr w:type="spellStart"/>
       <w:r>
@@ -7220,73 +7202,6 @@
     </w:p>
     <w:p>
       <w:pPr>
-        <w:jc w:val="center"/>
-      </w:pPr>
-      <w:r>
-        <w:rPr>
-          <w:rFonts w:ascii="Times New Roman" w:hAnsi="Times New Roman"/>
-          <w:i/>
-          <w:sz w:val="24"/>
-        </w:rPr>
-        <w:t xml:space="preserve">Obr. 5 - Návrh tří částí aplikace. Na obrázku by měly být samostatně popsány projekty </w:t>
-      </w:r>
-      <w:proofErr w:type="spellStart"/>
-      <w:r>
-        <w:rPr>
-          <w:rFonts w:ascii="Times New Roman" w:hAnsi="Times New Roman"/>
-          <w:i/>
-          <w:sz w:val="24"/>
-        </w:rPr>
-        <w:t>LoxoneBackend</w:t>
-      </w:r>
-      <w:proofErr w:type="spellEnd"/>
-      <w:r>
-        <w:rPr>
-          <w:rFonts w:ascii="Times New Roman" w:hAnsi="Times New Roman"/>
-          <w:i/>
-          <w:sz w:val="24"/>
-        </w:rPr>
-        <w:t xml:space="preserve">, </w:t>
-      </w:r>
-      <w:proofErr w:type="spellStart"/>
-      <w:r>
-        <w:rPr>
-          <w:rFonts w:ascii="Times New Roman" w:hAnsi="Times New Roman"/>
-          <w:i/>
-          <w:sz w:val="24"/>
-        </w:rPr>
-        <w:t>LoxoneProxyServer</w:t>
-      </w:r>
-      <w:proofErr w:type="spellEnd"/>
-      <w:r>
-        <w:rPr>
-          <w:rFonts w:ascii="Times New Roman" w:hAnsi="Times New Roman"/>
-          <w:i/>
-          <w:sz w:val="24"/>
-        </w:rPr>
-        <w:t xml:space="preserve"> a </w:t>
-      </w:r>
-      <w:proofErr w:type="spellStart"/>
-      <w:r>
-        <w:rPr>
-          <w:rFonts w:ascii="Times New Roman" w:hAnsi="Times New Roman"/>
-          <w:i/>
-          <w:sz w:val="24"/>
-        </w:rPr>
-        <w:t>LoxoneControlClient</w:t>
-      </w:r>
-      <w:proofErr w:type="spellEnd"/>
-      <w:r>
-        <w:rPr>
-          <w:rFonts w:ascii="Times New Roman" w:hAnsi="Times New Roman"/>
-          <w:i/>
-          <w:sz w:val="24"/>
-        </w:rPr>
-        <w:t>.</w:t>
-      </w:r>
-    </w:p>
-    <w:p>
-      <w:pPr>
         <w:pStyle w:val="Nadpis2"/>
       </w:pPr>
       <w:bookmarkStart w:id="24" w:name="_Toc230024992"/>
@@ -7403,19 +7318,6 @@
     </w:p>
     <w:p>
       <w:pPr>
-        <w:jc w:val="center"/>
-      </w:pPr>
-      <w:r>
-        <w:rPr>
-          <w:rFonts w:ascii="Times New Roman" w:hAnsi="Times New Roman"/>
-          <w:i/>
-          <w:sz w:val="24"/>
-        </w:rPr>
-        <w:t>Obr. 6 - Screenshot původní konzolové aplikace s menu pro zapnutí a vypnutí světla.</w:t>
-      </w:r>
-    </w:p>
-    <w:p>
-      <w:pPr>
         <w:pStyle w:val="Nadpis2"/>
       </w:pPr>
       <w:bookmarkStart w:id="25" w:name="_Toc230024993"/>
@@ -7775,22 +7677,43 @@
     <w:p>
       <w:pPr>
         <w:jc w:val="center"/>
-      </w:pPr>
-      <w:r>
         <w:rPr>
           <w:rFonts w:ascii="Times New Roman" w:hAnsi="Times New Roman"/>
           <w:i/>
           <w:sz w:val="24"/>
         </w:rPr>
-        <w:t xml:space="preserve">Obr. 7 - Screenshot spuštěného </w:t>
-      </w:r>
-      <w:proofErr w:type="spellStart"/>
+      </w:pPr>
       <w:r>
         <w:rPr>
           <w:rFonts w:ascii="Times New Roman" w:hAnsi="Times New Roman"/>
           <w:i/>
           <w:sz w:val="24"/>
         </w:rPr>
+        <w:t xml:space="preserve">Obr. </w:t>
+      </w:r>
+      <w:r>
+        <w:rPr>
+          <w:rFonts w:ascii="Times New Roman" w:hAnsi="Times New Roman"/>
+          <w:i/>
+          <w:sz w:val="24"/>
+        </w:rPr>
+        <w:t>4</w:t>
+      </w:r>
+      <w:r>
+        <w:rPr>
+          <w:rFonts w:ascii="Times New Roman" w:hAnsi="Times New Roman"/>
+          <w:i/>
+          <w:sz w:val="24"/>
+        </w:rPr>
+        <w:t xml:space="preserve"> - Screenshot spuštěného </w:t>
+      </w:r>
+      <w:proofErr w:type="spellStart"/>
+      <w:r>
+        <w:rPr>
+          <w:rFonts w:ascii="Times New Roman" w:hAnsi="Times New Roman"/>
+          <w:i/>
+          <w:sz w:val="24"/>
+        </w:rPr>
         <w:t>backendu</w:t>
       </w:r>
       <w:proofErr w:type="spellEnd"/>
@@ -7800,7 +7723,7 @@
           <w:i/>
           <w:sz w:val="24"/>
         </w:rPr>
-        <w:t xml:space="preserve"> v terminálu. Na obrázku by mělo být vidět, že aplikace poslouchá na portu 5000.</w:t>
+        <w:t xml:space="preserve"> v terminálu. Na obrázku by mělo být vidět, že aplikace poslouchá na portu 5000</w:t>
       </w:r>
     </w:p>
     <w:p>
@@ -7814,15 +7737,91 @@
           <w:sz w:val="24"/>
         </w:rPr>
         <w:lastRenderedPageBreak/>
-        <w:t>Obr. 8 - Screenshot testu adresy localhost:5000/</w:t>
-      </w:r>
-      <w:proofErr w:type="spellStart"/>
+        <w:drawing>
+          <wp:inline distT="0" distB="0" distL="0" distR="0" wp14:anchorId="71D23E92" wp14:editId="6CD6D5CA">
+            <wp:extent cx="6188710" cy="1513840"/>
+            <wp:effectExtent l="0" t="0" r="2540" b="0"/>
+            <wp:docPr id="1687745438" name="Obrázek 1"/>
+            <wp:cNvGraphicFramePr>
+              <a:graphicFrameLocks xmlns:a="http://schemas.openxmlformats.org/drawingml/2006/main" noChangeAspect="1"/>
+            </wp:cNvGraphicFramePr>
+            <a:graphic xmlns:a="http://schemas.openxmlformats.org/drawingml/2006/main">
+              <a:graphicData uri="http://schemas.openxmlformats.org/drawingml/2006/picture">
+                <pic:pic xmlns:pic="http://schemas.openxmlformats.org/drawingml/2006/picture">
+                  <pic:nvPicPr>
+                    <pic:cNvPr id="1687745438" name=""/>
+                    <pic:cNvPicPr/>
+                  </pic:nvPicPr>
+                  <pic:blipFill>
+                    <a:blip r:embed="rId17"/>
+                    <a:stretch>
+                      <a:fillRect/>
+                    </a:stretch>
+                  </pic:blipFill>
+                  <pic:spPr>
+                    <a:xfrm>
+                      <a:off x="0" y="0"/>
+                      <a:ext cx="6188710" cy="1513840"/>
+                    </a:xfrm>
+                    <a:prstGeom prst="rect">
+                      <a:avLst/>
+                    </a:prstGeom>
+                  </pic:spPr>
+                </pic:pic>
+              </a:graphicData>
+            </a:graphic>
+          </wp:inline>
+        </w:drawing>
+      </w:r>
       <w:r>
         <w:rPr>
           <w:rFonts w:ascii="Times New Roman" w:hAnsi="Times New Roman"/>
           <w:i/>
           <w:sz w:val="24"/>
         </w:rPr>
+        <w:t>.</w:t>
+      </w:r>
+    </w:p>
+    <w:p>
+      <w:pPr>
+        <w:jc w:val="center"/>
+        <w:rPr>
+          <w:rFonts w:ascii="Times New Roman" w:hAnsi="Times New Roman"/>
+          <w:i/>
+          <w:sz w:val="24"/>
+        </w:rPr>
+      </w:pPr>
+      <w:r>
+        <w:rPr>
+          <w:rFonts w:ascii="Times New Roman" w:hAnsi="Times New Roman"/>
+          <w:i/>
+          <w:sz w:val="24"/>
+        </w:rPr>
+        <w:t xml:space="preserve">Obr. </w:t>
+      </w:r>
+      <w:r>
+        <w:rPr>
+          <w:rFonts w:ascii="Times New Roman" w:hAnsi="Times New Roman"/>
+          <w:i/>
+          <w:sz w:val="24"/>
+        </w:rPr>
+        <w:t>5</w:t>
+      </w:r>
+      <w:r>
+        <w:rPr>
+          <w:rFonts w:ascii="Times New Roman" w:hAnsi="Times New Roman"/>
+          <w:i/>
+          <w:sz w:val="24"/>
+        </w:rPr>
+        <w:t xml:space="preserve"> - Screenshot testu adresy localhost:5000/</w:t>
+      </w:r>
+      <w:proofErr w:type="spellStart"/>
+      <w:r>
+        <w:rPr>
+          <w:rFonts w:ascii="Times New Roman" w:hAnsi="Times New Roman"/>
+          <w:i/>
+          <w:sz w:val="24"/>
+        </w:rPr>
         <w:t>light</w:t>
       </w:r>
       <w:proofErr w:type="spellEnd"/>
@@ -7833,6 +7832,48 @@
           <w:sz w:val="24"/>
         </w:rPr>
         <w:t>/on v prohlížeči nebo v konzoli.</w:t>
+      </w:r>
+    </w:p>
+    <w:p>
+      <w:pPr>
+        <w:jc w:val="center"/>
+      </w:pPr>
+      <w:r>
+        <w:drawing>
+          <wp:inline distT="0" distB="0" distL="0" distR="0" wp14:anchorId="6045D354" wp14:editId="4D9C0B22">
+            <wp:extent cx="6188710" cy="904240"/>
+            <wp:effectExtent l="0" t="0" r="2540" b="0"/>
+            <wp:docPr id="2020499639" name="Obrázek 1"/>
+            <wp:cNvGraphicFramePr>
+              <a:graphicFrameLocks xmlns:a="http://schemas.openxmlformats.org/drawingml/2006/main" noChangeAspect="1"/>
+            </wp:cNvGraphicFramePr>
+            <a:graphic xmlns:a="http://schemas.openxmlformats.org/drawingml/2006/main">
+              <a:graphicData uri="http://schemas.openxmlformats.org/drawingml/2006/picture">
+                <pic:pic xmlns:pic="http://schemas.openxmlformats.org/drawingml/2006/picture">
+                  <pic:nvPicPr>
+                    <pic:cNvPr id="2020499639" name=""/>
+                    <pic:cNvPicPr/>
+                  </pic:nvPicPr>
+                  <pic:blipFill>
+                    <a:blip r:embed="rId18"/>
+                    <a:stretch>
+                      <a:fillRect/>
+                    </a:stretch>
+                  </pic:blipFill>
+                  <pic:spPr>
+                    <a:xfrm>
+                      <a:off x="0" y="0"/>
+                      <a:ext cx="6188710" cy="904240"/>
+                    </a:xfrm>
+                    <a:prstGeom prst="rect">
+                      <a:avLst/>
+                    </a:prstGeom>
+                  </pic:spPr>
+                </pic:pic>
+              </a:graphicData>
+            </a:graphic>
+          </wp:inline>
+        </w:drawing>
       </w:r>
     </w:p>
     <w:p>
@@ -8130,22 +8171,43 @@
     <w:p>
       <w:pPr>
         <w:jc w:val="center"/>
-      </w:pPr>
-      <w:r>
         <w:rPr>
           <w:rFonts w:ascii="Times New Roman" w:hAnsi="Times New Roman"/>
           <w:i/>
           <w:sz w:val="24"/>
         </w:rPr>
-        <w:t xml:space="preserve">Obr. 9 - Screenshot spuštěného </w:t>
-      </w:r>
-      <w:proofErr w:type="spellStart"/>
+      </w:pPr>
       <w:r>
         <w:rPr>
           <w:rFonts w:ascii="Times New Roman" w:hAnsi="Times New Roman"/>
           <w:i/>
           <w:sz w:val="24"/>
         </w:rPr>
+        <w:t xml:space="preserve">Obr. </w:t>
+      </w:r>
+      <w:r>
+        <w:rPr>
+          <w:rFonts w:ascii="Times New Roman" w:hAnsi="Times New Roman"/>
+          <w:i/>
+          <w:sz w:val="24"/>
+        </w:rPr>
+        <w:t>6</w:t>
+      </w:r>
+      <w:r>
+        <w:rPr>
+          <w:rFonts w:ascii="Times New Roman" w:hAnsi="Times New Roman"/>
+          <w:i/>
+          <w:sz w:val="24"/>
+        </w:rPr>
+        <w:t xml:space="preserve"> - Screenshot spuštěného </w:t>
+      </w:r>
+      <w:proofErr w:type="spellStart"/>
+      <w:r>
+        <w:rPr>
+          <w:rFonts w:ascii="Times New Roman" w:hAnsi="Times New Roman"/>
+          <w:i/>
+          <w:sz w:val="24"/>
+        </w:rPr>
         <w:t>proxy</w:t>
       </w:r>
       <w:proofErr w:type="spellEnd"/>
@@ -8191,7 +8253,26 @@
           <w:i/>
           <w:sz w:val="24"/>
         </w:rPr>
-        <w:t xml:space="preserve"> on: http://0.0.0.0:8080.</w:t>
+        <w:t xml:space="preserve"> on: </w:t>
+      </w:r>
+      <w:hyperlink r:id="rId19" w:history="1">
+        <w:r>
+          <w:rPr>
+            <w:rStyle w:val="Hypertextovodkaz"/>
+            <w:rFonts w:ascii="Times New Roman" w:hAnsi="Times New Roman"/>
+            <w:i/>
+            <w:sz w:val="24"/>
+          </w:rPr>
+          <w:t>http://0.0.0.0:8080</w:t>
+        </w:r>
+      </w:hyperlink>
+      <w:r>
+        <w:rPr>
+          <w:rFonts w:ascii="Times New Roman" w:hAnsi="Times New Roman"/>
+          <w:i/>
+          <w:sz w:val="24"/>
+        </w:rPr>
+        <w:t>.</w:t>
       </w:r>
     </w:p>
     <w:p>
@@ -8199,20 +8280,83 @@
         <w:jc w:val="center"/>
       </w:pPr>
       <w:r>
+        <w:drawing>
+          <wp:inline distT="0" distB="0" distL="0" distR="0" wp14:anchorId="04E5D85A" wp14:editId="3FEE7315">
+            <wp:extent cx="6188710" cy="2034540"/>
+            <wp:effectExtent l="0" t="0" r="2540" b="3810"/>
+            <wp:docPr id="1428219232" name="Obrázek 1"/>
+            <wp:cNvGraphicFramePr>
+              <a:graphicFrameLocks xmlns:a="http://schemas.openxmlformats.org/drawingml/2006/main" noChangeAspect="1"/>
+            </wp:cNvGraphicFramePr>
+            <a:graphic xmlns:a="http://schemas.openxmlformats.org/drawingml/2006/main">
+              <a:graphicData uri="http://schemas.openxmlformats.org/drawingml/2006/picture">
+                <pic:pic xmlns:pic="http://schemas.openxmlformats.org/drawingml/2006/picture">
+                  <pic:nvPicPr>
+                    <pic:cNvPr id="1428219232" name=""/>
+                    <pic:cNvPicPr/>
+                  </pic:nvPicPr>
+                  <pic:blipFill>
+                    <a:blip r:embed="rId20"/>
+                    <a:stretch>
+                      <a:fillRect/>
+                    </a:stretch>
+                  </pic:blipFill>
+                  <pic:spPr>
+                    <a:xfrm>
+                      <a:off x="0" y="0"/>
+                      <a:ext cx="6188710" cy="2034540"/>
+                    </a:xfrm>
+                    <a:prstGeom prst="rect">
+                      <a:avLst/>
+                    </a:prstGeom>
+                  </pic:spPr>
+                </pic:pic>
+              </a:graphicData>
+            </a:graphic>
+          </wp:inline>
+        </w:drawing>
+      </w:r>
+    </w:p>
+    <w:p>
+      <w:pPr>
+        <w:jc w:val="center"/>
         <w:rPr>
           <w:rFonts w:ascii="Times New Roman" w:hAnsi="Times New Roman"/>
           <w:i/>
           <w:sz w:val="24"/>
         </w:rPr>
-        <w:t>Obr. 10 - Screenshot testu adresy localhost:8080/</w:t>
-      </w:r>
-      <w:proofErr w:type="spellStart"/>
+      </w:pPr>
       <w:r>
         <w:rPr>
           <w:rFonts w:ascii="Times New Roman" w:hAnsi="Times New Roman"/>
           <w:i/>
           <w:sz w:val="24"/>
         </w:rPr>
+        <w:t xml:space="preserve">Obr. </w:t>
+      </w:r>
+      <w:r>
+        <w:rPr>
+          <w:rFonts w:ascii="Times New Roman" w:hAnsi="Times New Roman"/>
+          <w:i/>
+          <w:sz w:val="24"/>
+        </w:rPr>
+        <w:t>7</w:t>
+      </w:r>
+      <w:r>
+        <w:rPr>
+          <w:rFonts w:ascii="Times New Roman" w:hAnsi="Times New Roman"/>
+          <w:i/>
+          <w:sz w:val="24"/>
+        </w:rPr>
+        <w:t xml:space="preserve"> - Screenshot testu adresy localhost:8080/</w:t>
+      </w:r>
+      <w:proofErr w:type="spellStart"/>
+      <w:r>
+        <w:rPr>
+          <w:rFonts w:ascii="Times New Roman" w:hAnsi="Times New Roman"/>
+          <w:i/>
+          <w:sz w:val="24"/>
+        </w:rPr>
         <w:t>loxone</w:t>
       </w:r>
       <w:proofErr w:type="spellEnd"/>
@@ -8277,6 +8421,49 @@
           <w:sz w:val="24"/>
         </w:rPr>
         <w:t>.</w:t>
+      </w:r>
+    </w:p>
+    <w:p>
+      <w:pPr>
+        <w:jc w:val="center"/>
+      </w:pPr>
+      <w:r>
+        <w:lastRenderedPageBreak/>
+        <w:drawing>
+          <wp:inline distT="0" distB="0" distL="0" distR="0" wp14:anchorId="09D70BFE" wp14:editId="5DF9F723">
+            <wp:extent cx="6188710" cy="894080"/>
+            <wp:effectExtent l="0" t="0" r="2540" b="1270"/>
+            <wp:docPr id="266922541" name="Obrázek 1"/>
+            <wp:cNvGraphicFramePr>
+              <a:graphicFrameLocks xmlns:a="http://schemas.openxmlformats.org/drawingml/2006/main" noChangeAspect="1"/>
+            </wp:cNvGraphicFramePr>
+            <a:graphic xmlns:a="http://schemas.openxmlformats.org/drawingml/2006/main">
+              <a:graphicData uri="http://schemas.openxmlformats.org/drawingml/2006/picture">
+                <pic:pic xmlns:pic="http://schemas.openxmlformats.org/drawingml/2006/picture">
+                  <pic:nvPicPr>
+                    <pic:cNvPr id="266922541" name=""/>
+                    <pic:cNvPicPr/>
+                  </pic:nvPicPr>
+                  <pic:blipFill>
+                    <a:blip r:embed="rId21"/>
+                    <a:stretch>
+                      <a:fillRect/>
+                    </a:stretch>
+                  </pic:blipFill>
+                  <pic:spPr>
+                    <a:xfrm>
+                      <a:off x="0" y="0"/>
+                      <a:ext cx="6188710" cy="894080"/>
+                    </a:xfrm>
+                    <a:prstGeom prst="rect">
+                      <a:avLst/>
+                    </a:prstGeom>
+                  </pic:spPr>
+                </pic:pic>
+              </a:graphicData>
+            </a:graphic>
+          </wp:inline>
+        </w:drawing>
       </w:r>
     </w:p>
     <w:p>
@@ -8470,14 +8657,77 @@
     <w:p>
       <w:pPr>
         <w:jc w:val="center"/>
-      </w:pPr>
-      <w:r>
         <w:rPr>
           <w:rFonts w:ascii="Times New Roman" w:hAnsi="Times New Roman"/>
           <w:i/>
           <w:sz w:val="24"/>
         </w:rPr>
-        <w:t>Obr. 11 - Screenshot konzolového klienta s volbami 1, 0, T a Q.</w:t>
+      </w:pPr>
+      <w:r>
+        <w:rPr>
+          <w:rFonts w:ascii="Times New Roman" w:hAnsi="Times New Roman"/>
+          <w:i/>
+          <w:sz w:val="24"/>
+        </w:rPr>
+        <w:t xml:space="preserve">Obr. </w:t>
+      </w:r>
+      <w:r>
+        <w:rPr>
+          <w:rFonts w:ascii="Times New Roman" w:hAnsi="Times New Roman"/>
+          <w:i/>
+          <w:sz w:val="24"/>
+        </w:rPr>
+        <w:t>8</w:t>
+      </w:r>
+      <w:r>
+        <w:rPr>
+          <w:rFonts w:ascii="Times New Roman" w:hAnsi="Times New Roman"/>
+          <w:i/>
+          <w:sz w:val="24"/>
+        </w:rPr>
+        <w:t xml:space="preserve"> - Screenshot konzolového klienta s volbami 1, 0, T a Q.</w:t>
+      </w:r>
+    </w:p>
+    <w:p>
+      <w:pPr>
+        <w:jc w:val="center"/>
+      </w:pPr>
+      <w:r>
+        <w:drawing>
+          <wp:inline distT="0" distB="0" distL="0" distR="0" wp14:anchorId="0E9F2932" wp14:editId="2C017BA2">
+            <wp:extent cx="6188710" cy="1136650"/>
+            <wp:effectExtent l="0" t="0" r="2540" b="6350"/>
+            <wp:docPr id="1143219260" name="Obrázek 1"/>
+            <wp:cNvGraphicFramePr>
+              <a:graphicFrameLocks xmlns:a="http://schemas.openxmlformats.org/drawingml/2006/main" noChangeAspect="1"/>
+            </wp:cNvGraphicFramePr>
+            <a:graphic xmlns:a="http://schemas.openxmlformats.org/drawingml/2006/main">
+              <a:graphicData uri="http://schemas.openxmlformats.org/drawingml/2006/picture">
+                <pic:pic xmlns:pic="http://schemas.openxmlformats.org/drawingml/2006/picture">
+                  <pic:nvPicPr>
+                    <pic:cNvPr id="1143219260" name=""/>
+                    <pic:cNvPicPr/>
+                  </pic:nvPicPr>
+                  <pic:blipFill>
+                    <a:blip r:embed="rId22"/>
+                    <a:stretch>
+                      <a:fillRect/>
+                    </a:stretch>
+                  </pic:blipFill>
+                  <pic:spPr>
+                    <a:xfrm>
+                      <a:off x="0" y="0"/>
+                      <a:ext cx="6188710" cy="1136650"/>
+                    </a:xfrm>
+                    <a:prstGeom prst="rect">
+                      <a:avLst/>
+                    </a:prstGeom>
+                  </pic:spPr>
+                </pic:pic>
+              </a:graphicData>
+            </a:graphic>
+          </wp:inline>
+        </w:drawing>
       </w:r>
     </w:p>
     <w:p>
@@ -8854,100 +9104,78 @@
     <w:p>
       <w:pPr>
         <w:jc w:val="center"/>
-      </w:pPr>
-      <w:r>
         <w:rPr>
           <w:rFonts w:ascii="Times New Roman" w:hAnsi="Times New Roman"/>
           <w:i/>
           <w:sz w:val="24"/>
         </w:rPr>
+      </w:pPr>
+      <w:r>
+        <w:rPr>
+          <w:rFonts w:ascii="Times New Roman" w:hAnsi="Times New Roman"/>
+          <w:i/>
+          <w:sz w:val="24"/>
+        </w:rPr>
+        <w:t xml:space="preserve">Obr. </w:t>
+      </w:r>
+      <w:r>
+        <w:rPr>
+          <w:rFonts w:ascii="Times New Roman" w:hAnsi="Times New Roman"/>
+          <w:i/>
+          <w:sz w:val="24"/>
+        </w:rPr>
+        <w:t>9</w:t>
+      </w:r>
+      <w:r>
+        <w:rPr>
+          <w:rFonts w:ascii="Times New Roman" w:hAnsi="Times New Roman"/>
+          <w:i/>
+          <w:sz w:val="24"/>
+        </w:rPr>
+        <w:t xml:space="preserve"> - Screenshot konzole po stisknutí klávesy T, kde je vypsaná odpověď s teplotou.</w:t>
+      </w:r>
+    </w:p>
+    <w:p>
+      <w:pPr>
+        <w:jc w:val="center"/>
+      </w:pPr>
+      <w:r>
         <w:lastRenderedPageBreak/>
-        <w:t xml:space="preserve">Obr. 12 - Screenshot </w:t>
-      </w:r>
-      <w:proofErr w:type="spellStart"/>
-      <w:r>
-        <w:rPr>
-          <w:rFonts w:ascii="Times New Roman" w:hAnsi="Times New Roman"/>
-          <w:i/>
-          <w:sz w:val="24"/>
-        </w:rPr>
-        <w:t>JSONu</w:t>
-      </w:r>
-      <w:proofErr w:type="spellEnd"/>
-      <w:r>
-        <w:rPr>
-          <w:rFonts w:ascii="Times New Roman" w:hAnsi="Times New Roman"/>
-          <w:i/>
-          <w:sz w:val="24"/>
-        </w:rPr>
-        <w:t xml:space="preserve"> s prvkem </w:t>
-      </w:r>
-      <w:proofErr w:type="spellStart"/>
-      <w:r>
-        <w:rPr>
-          <w:rFonts w:ascii="Times New Roman" w:hAnsi="Times New Roman"/>
-          <w:i/>
-          <w:sz w:val="24"/>
-        </w:rPr>
-        <w:t>Temperature</w:t>
-      </w:r>
-      <w:proofErr w:type="spellEnd"/>
-      <w:r>
-        <w:rPr>
-          <w:rFonts w:ascii="Times New Roman" w:hAnsi="Times New Roman"/>
-          <w:i/>
-          <w:sz w:val="24"/>
-        </w:rPr>
-        <w:t xml:space="preserve"> typu </w:t>
-      </w:r>
-      <w:proofErr w:type="spellStart"/>
-      <w:r>
-        <w:rPr>
-          <w:rFonts w:ascii="Times New Roman" w:hAnsi="Times New Roman"/>
-          <w:i/>
-          <w:sz w:val="24"/>
-        </w:rPr>
-        <w:t>InfoOnlyAnalog</w:t>
-      </w:r>
-      <w:proofErr w:type="spellEnd"/>
-      <w:r>
-        <w:rPr>
-          <w:rFonts w:ascii="Times New Roman" w:hAnsi="Times New Roman"/>
-          <w:i/>
-          <w:sz w:val="24"/>
-        </w:rPr>
-        <w:t xml:space="preserve"> a UUID 204db4c1-01b6-</w:t>
-      </w:r>
-      <w:proofErr w:type="gramStart"/>
-      <w:r>
-        <w:rPr>
-          <w:rFonts w:ascii="Times New Roman" w:hAnsi="Times New Roman"/>
-          <w:i/>
-          <w:sz w:val="24"/>
-        </w:rPr>
-        <w:t>1226-ffff42f1439d4ef5</w:t>
-      </w:r>
-      <w:proofErr w:type="gramEnd"/>
-      <w:r>
-        <w:rPr>
-          <w:rFonts w:ascii="Times New Roman" w:hAnsi="Times New Roman"/>
-          <w:i/>
-          <w:sz w:val="24"/>
-        </w:rPr>
-        <w:t>.</w:t>
-      </w:r>
-    </w:p>
-    <w:p>
-      <w:pPr>
-        <w:jc w:val="center"/>
-      </w:pPr>
-      <w:r>
-        <w:rPr>
-          <w:rFonts w:ascii="Times New Roman" w:hAnsi="Times New Roman"/>
-          <w:i/>
-          <w:sz w:val="24"/>
-        </w:rPr>
-        <w:t>Obr. 13 - Screenshot konzole po stisknutí klávesy T, kde je vypsaná odpověď s teplotou.</w:t>
+        <w:drawing>
+          <wp:inline distT="0" distB="0" distL="0" distR="0" wp14:anchorId="24A5C5BF" wp14:editId="728D8767">
+            <wp:extent cx="6188710" cy="1647825"/>
+            <wp:effectExtent l="0" t="0" r="2540" b="9525"/>
+            <wp:docPr id="2077925810" name="Obrázek 1"/>
+            <wp:cNvGraphicFramePr>
+              <a:graphicFrameLocks xmlns:a="http://schemas.openxmlformats.org/drawingml/2006/main" noChangeAspect="1"/>
+            </wp:cNvGraphicFramePr>
+            <a:graphic xmlns:a="http://schemas.openxmlformats.org/drawingml/2006/main">
+              <a:graphicData uri="http://schemas.openxmlformats.org/drawingml/2006/picture">
+                <pic:pic xmlns:pic="http://schemas.openxmlformats.org/drawingml/2006/picture">
+                  <pic:nvPicPr>
+                    <pic:cNvPr id="2077925810" name=""/>
+                    <pic:cNvPicPr/>
+                  </pic:nvPicPr>
+                  <pic:blipFill>
+                    <a:blip r:embed="rId23"/>
+                    <a:stretch>
+                      <a:fillRect/>
+                    </a:stretch>
+                  </pic:blipFill>
+                  <pic:spPr>
+                    <a:xfrm>
+                      <a:off x="0" y="0"/>
+                      <a:ext cx="6188710" cy="1647825"/>
+                    </a:xfrm>
+                    <a:prstGeom prst="rect">
+                      <a:avLst/>
+                    </a:prstGeom>
+                  </pic:spPr>
+                </pic:pic>
+              </a:graphicData>
+            </a:graphic>
+          </wp:inline>
+        </w:drawing>
       </w:r>
     </w:p>
     <w:p>
@@ -9210,6 +9438,7 @@
         <w:t xml:space="preserve"> server není program, který zapíná světlo, ale pouze prostředník mezi klientem a </w:t>
       </w:r>
       <w:proofErr w:type="spellStart"/>
+      <w:proofErr w:type="gramStart"/>
       <w:r>
         <w:rPr>
           <w:rFonts w:ascii="Times New Roman" w:hAnsi="Times New Roman"/>
@@ -9225,37 +9454,15 @@
         </w:rPr>
         <w:t>.</w:t>
       </w:r>
-    </w:p>
-    <w:p>
-      <w:pPr>
-        <w:jc w:val="center"/>
-      </w:pPr>
       <w:r>
         <w:rPr>
           <w:rFonts w:ascii="Times New Roman" w:hAnsi="Times New Roman"/>
           <w:i/>
           <w:sz w:val="24"/>
         </w:rPr>
-        <w:t xml:space="preserve">Obr. 14 - Screenshot jedné z chyb při vývoji, například 401 </w:t>
-      </w:r>
-      <w:proofErr w:type="spellStart"/>
-      <w:r>
-        <w:rPr>
-          <w:rFonts w:ascii="Times New Roman" w:hAnsi="Times New Roman"/>
-          <w:i/>
-          <w:sz w:val="24"/>
-        </w:rPr>
-        <w:t>Unauthorized</w:t>
-      </w:r>
-      <w:proofErr w:type="spellEnd"/>
-      <w:r>
-        <w:rPr>
-          <w:rFonts w:ascii="Times New Roman" w:hAnsi="Times New Roman"/>
-          <w:i/>
-          <w:sz w:val="24"/>
-        </w:rPr>
-        <w:t xml:space="preserve"> nebo chyba duplicitní třídy Program.</w:t>
-      </w:r>
+        <w:t>.</w:t>
+      </w:r>
+      <w:proofErr w:type="gramEnd"/>
     </w:p>
     <w:p>
       <w:pPr>
@@ -9831,7 +10038,37 @@
           <w:rFonts w:ascii="Times New Roman" w:hAnsi="Times New Roman"/>
           <w:sz w:val="24"/>
         </w:rPr>
-        <w:t>Obr. 4 - Schéma navržené architektury aplikace.</w:t>
+        <w:t xml:space="preserve">Obr. </w:t>
+      </w:r>
+      <w:r>
+        <w:rPr>
+          <w:rFonts w:ascii="Times New Roman" w:hAnsi="Times New Roman"/>
+          <w:sz w:val="24"/>
+        </w:rPr>
+        <w:t>4</w:t>
+      </w:r>
+      <w:r>
+        <w:rPr>
+          <w:rFonts w:ascii="Times New Roman" w:hAnsi="Times New Roman"/>
+          <w:sz w:val="24"/>
+        </w:rPr>
+        <w:t xml:space="preserve"> - Screenshot spuštěného </w:t>
+      </w:r>
+      <w:proofErr w:type="spellStart"/>
+      <w:r>
+        <w:rPr>
+          <w:rFonts w:ascii="Times New Roman" w:hAnsi="Times New Roman"/>
+          <w:sz w:val="24"/>
+        </w:rPr>
+        <w:t>backendu</w:t>
+      </w:r>
+      <w:proofErr w:type="spellEnd"/>
+      <w:r>
+        <w:rPr>
+          <w:rFonts w:ascii="Times New Roman" w:hAnsi="Times New Roman"/>
+          <w:sz w:val="24"/>
+        </w:rPr>
+        <w:t xml:space="preserve"> na portu 5000.</w:t>
       </w:r>
     </w:p>
     <w:p>
@@ -9844,7 +10081,37 @@
           <w:rFonts w:ascii="Times New Roman" w:hAnsi="Times New Roman"/>
           <w:sz w:val="24"/>
         </w:rPr>
-        <w:t>Obr. 5 - Návrh tří částí aplikace.</w:t>
+        <w:t xml:space="preserve">Obr. </w:t>
+      </w:r>
+      <w:r>
+        <w:rPr>
+          <w:rFonts w:ascii="Times New Roman" w:hAnsi="Times New Roman"/>
+          <w:sz w:val="24"/>
+        </w:rPr>
+        <w:t>5</w:t>
+      </w:r>
+      <w:r>
+        <w:rPr>
+          <w:rFonts w:ascii="Times New Roman" w:hAnsi="Times New Roman"/>
+          <w:sz w:val="24"/>
+        </w:rPr>
+        <w:t xml:space="preserve"> - Screenshot testu adresy /</w:t>
+      </w:r>
+      <w:proofErr w:type="spellStart"/>
+      <w:r>
+        <w:rPr>
+          <w:rFonts w:ascii="Times New Roman" w:hAnsi="Times New Roman"/>
+          <w:sz w:val="24"/>
+        </w:rPr>
+        <w:t>light</w:t>
+      </w:r>
+      <w:proofErr w:type="spellEnd"/>
+      <w:r>
+        <w:rPr>
+          <w:rFonts w:ascii="Times New Roman" w:hAnsi="Times New Roman"/>
+          <w:sz w:val="24"/>
+        </w:rPr>
+        <w:t>/on.</w:t>
       </w:r>
     </w:p>
     <w:p>
@@ -9857,7 +10124,37 @@
           <w:rFonts w:ascii="Times New Roman" w:hAnsi="Times New Roman"/>
           <w:sz w:val="24"/>
         </w:rPr>
-        <w:t>Obr. 6 - Screenshot původní konzolové aplikace.</w:t>
+        <w:t xml:space="preserve">Obr. </w:t>
+      </w:r>
+      <w:r>
+        <w:rPr>
+          <w:rFonts w:ascii="Times New Roman" w:hAnsi="Times New Roman"/>
+          <w:sz w:val="24"/>
+        </w:rPr>
+        <w:t>6</w:t>
+      </w:r>
+      <w:r>
+        <w:rPr>
+          <w:rFonts w:ascii="Times New Roman" w:hAnsi="Times New Roman"/>
+          <w:sz w:val="24"/>
+        </w:rPr>
+        <w:t xml:space="preserve"> - Screenshot spuštěného </w:t>
+      </w:r>
+      <w:proofErr w:type="spellStart"/>
+      <w:r>
+        <w:rPr>
+          <w:rFonts w:ascii="Times New Roman" w:hAnsi="Times New Roman"/>
+          <w:sz w:val="24"/>
+        </w:rPr>
+        <w:t>proxy</w:t>
+      </w:r>
+      <w:proofErr w:type="spellEnd"/>
+      <w:r>
+        <w:rPr>
+          <w:rFonts w:ascii="Times New Roman" w:hAnsi="Times New Roman"/>
+          <w:sz w:val="24"/>
+        </w:rPr>
+        <w:t xml:space="preserve"> serveru na portu 8080.</w:t>
       </w:r>
     </w:p>
     <w:p>
@@ -9870,23 +10167,53 @@
           <w:rFonts w:ascii="Times New Roman" w:hAnsi="Times New Roman"/>
           <w:sz w:val="24"/>
         </w:rPr>
-        <w:t xml:space="preserve">Obr. 7 - Screenshot spuštěného </w:t>
-      </w:r>
-      <w:proofErr w:type="spellStart"/>
-      <w:r>
-        <w:rPr>
-          <w:rFonts w:ascii="Times New Roman" w:hAnsi="Times New Roman"/>
-          <w:sz w:val="24"/>
-        </w:rPr>
-        <w:t>backendu</w:t>
-      </w:r>
-      <w:proofErr w:type="spellEnd"/>
-      <w:r>
-        <w:rPr>
-          <w:rFonts w:ascii="Times New Roman" w:hAnsi="Times New Roman"/>
-          <w:sz w:val="24"/>
-        </w:rPr>
-        <w:t xml:space="preserve"> na portu 5000.</w:t>
+        <w:t xml:space="preserve">Obr. </w:t>
+      </w:r>
+      <w:r>
+        <w:rPr>
+          <w:rFonts w:ascii="Times New Roman" w:hAnsi="Times New Roman"/>
+          <w:sz w:val="24"/>
+        </w:rPr>
+        <w:t>7</w:t>
+      </w:r>
+      <w:r>
+        <w:rPr>
+          <w:rFonts w:ascii="Times New Roman" w:hAnsi="Times New Roman"/>
+          <w:sz w:val="24"/>
+        </w:rPr>
+        <w:t xml:space="preserve"> - Screenshot testu adresy /</w:t>
+      </w:r>
+      <w:proofErr w:type="spellStart"/>
+      <w:r>
+        <w:rPr>
+          <w:rFonts w:ascii="Times New Roman" w:hAnsi="Times New Roman"/>
+          <w:sz w:val="24"/>
+        </w:rPr>
+        <w:t>loxone</w:t>
+      </w:r>
+      <w:proofErr w:type="spellEnd"/>
+      <w:r>
+        <w:rPr>
+          <w:rFonts w:ascii="Times New Roman" w:hAnsi="Times New Roman"/>
+          <w:sz w:val="24"/>
+        </w:rPr>
+        <w:t>/</w:t>
+      </w:r>
+      <w:proofErr w:type="spellStart"/>
+      <w:r>
+        <w:rPr>
+          <w:rFonts w:ascii="Times New Roman" w:hAnsi="Times New Roman"/>
+          <w:sz w:val="24"/>
+        </w:rPr>
+        <w:t>light</w:t>
+      </w:r>
+      <w:proofErr w:type="spellEnd"/>
+      <w:r>
+        <w:rPr>
+          <w:rFonts w:ascii="Times New Roman" w:hAnsi="Times New Roman"/>
+          <w:sz w:val="24"/>
+        </w:rPr>
+        <w:t>/on.</w:t>
       </w:r>
     </w:p>
     <w:p>
@@ -9899,23 +10226,21 @@
           <w:rFonts w:ascii="Times New Roman" w:hAnsi="Times New Roman"/>
           <w:sz w:val="24"/>
         </w:rPr>
-        <w:t>Obr. 8 - Screenshot testu adresy /</w:t>
-      </w:r>
-      <w:proofErr w:type="spellStart"/>
-      <w:r>
-        <w:rPr>
-          <w:rFonts w:ascii="Times New Roman" w:hAnsi="Times New Roman"/>
-          <w:sz w:val="24"/>
-        </w:rPr>
-        <w:t>light</w:t>
-      </w:r>
-      <w:proofErr w:type="spellEnd"/>
-      <w:r>
-        <w:rPr>
-          <w:rFonts w:ascii="Times New Roman" w:hAnsi="Times New Roman"/>
-          <w:sz w:val="24"/>
-        </w:rPr>
-        <w:t>/on.</w:t>
+        <w:t xml:space="preserve">Obr. </w:t>
+      </w:r>
+      <w:r>
+        <w:rPr>
+          <w:rFonts w:ascii="Times New Roman" w:hAnsi="Times New Roman"/>
+          <w:sz w:val="24"/>
+        </w:rPr>
+        <w:t xml:space="preserve">8 </w:t>
+      </w:r>
+      <w:r>
+        <w:rPr>
+          <w:rFonts w:ascii="Times New Roman" w:hAnsi="Times New Roman"/>
+          <w:sz w:val="24"/>
+        </w:rPr>
+        <w:t>- Screenshot konzolového klienta s ovládacím menu.</w:t>
       </w:r>
     </w:p>
     <w:p>
@@ -9928,152 +10253,21 @@
           <w:rFonts w:ascii="Times New Roman" w:hAnsi="Times New Roman"/>
           <w:sz w:val="24"/>
         </w:rPr>
-        <w:t xml:space="preserve">Obr. 9 - Screenshot spuštěného </w:t>
-      </w:r>
-      <w:proofErr w:type="spellStart"/>
-      <w:r>
-        <w:rPr>
-          <w:rFonts w:ascii="Times New Roman" w:hAnsi="Times New Roman"/>
-          <w:sz w:val="24"/>
-        </w:rPr>
-        <w:t>proxy</w:t>
-      </w:r>
-      <w:proofErr w:type="spellEnd"/>
-      <w:r>
-        <w:rPr>
-          <w:rFonts w:ascii="Times New Roman" w:hAnsi="Times New Roman"/>
-          <w:sz w:val="24"/>
-        </w:rPr>
-        <w:t xml:space="preserve"> serveru na portu 8080.</w:t>
-      </w:r>
-    </w:p>
-    <w:p>
-      <w:pPr>
-        <w:spacing w:after="120"/>
-        <w:ind w:firstLine="360"/>
-      </w:pPr>
-      <w:r>
-        <w:rPr>
-          <w:rFonts w:ascii="Times New Roman" w:hAnsi="Times New Roman"/>
-          <w:sz w:val="24"/>
-        </w:rPr>
-        <w:t>Obr. 10 - Screenshot testu adresy /</w:t>
-      </w:r>
-      <w:proofErr w:type="spellStart"/>
-      <w:r>
-        <w:rPr>
-          <w:rFonts w:ascii="Times New Roman" w:hAnsi="Times New Roman"/>
-          <w:sz w:val="24"/>
-        </w:rPr>
-        <w:t>loxone</w:t>
-      </w:r>
-      <w:proofErr w:type="spellEnd"/>
-      <w:r>
-        <w:rPr>
-          <w:rFonts w:ascii="Times New Roman" w:hAnsi="Times New Roman"/>
-          <w:sz w:val="24"/>
-        </w:rPr>
-        <w:t>/</w:t>
-      </w:r>
-      <w:proofErr w:type="spellStart"/>
-      <w:r>
-        <w:rPr>
-          <w:rFonts w:ascii="Times New Roman" w:hAnsi="Times New Roman"/>
-          <w:sz w:val="24"/>
-        </w:rPr>
-        <w:t>light</w:t>
-      </w:r>
-      <w:proofErr w:type="spellEnd"/>
-      <w:r>
-        <w:rPr>
-          <w:rFonts w:ascii="Times New Roman" w:hAnsi="Times New Roman"/>
-          <w:sz w:val="24"/>
-        </w:rPr>
-        <w:t>/on.</w:t>
-      </w:r>
-    </w:p>
-    <w:p>
-      <w:pPr>
-        <w:spacing w:after="120"/>
-        <w:ind w:firstLine="360"/>
-      </w:pPr>
-      <w:r>
-        <w:rPr>
-          <w:rFonts w:ascii="Times New Roman" w:hAnsi="Times New Roman"/>
-          <w:sz w:val="24"/>
-        </w:rPr>
-        <w:t>Obr. 11 - Screenshot konzolového klienta s ovládacím menu.</w:t>
-      </w:r>
-    </w:p>
-    <w:p>
-      <w:pPr>
-        <w:spacing w:after="120"/>
-        <w:ind w:firstLine="360"/>
-      </w:pPr>
-      <w:r>
-        <w:rPr>
-          <w:rFonts w:ascii="Times New Roman" w:hAnsi="Times New Roman"/>
-          <w:sz w:val="24"/>
-        </w:rPr>
-        <w:t xml:space="preserve">Obr. 12 - Screenshot </w:t>
-      </w:r>
-      <w:proofErr w:type="spellStart"/>
-      <w:r>
-        <w:rPr>
-          <w:rFonts w:ascii="Times New Roman" w:hAnsi="Times New Roman"/>
-          <w:sz w:val="24"/>
-        </w:rPr>
-        <w:t>JSONu</w:t>
-      </w:r>
-      <w:proofErr w:type="spellEnd"/>
-      <w:r>
-        <w:rPr>
-          <w:rFonts w:ascii="Times New Roman" w:hAnsi="Times New Roman"/>
-          <w:sz w:val="24"/>
-        </w:rPr>
-        <w:t xml:space="preserve"> s prvkem </w:t>
-      </w:r>
-      <w:proofErr w:type="spellStart"/>
-      <w:r>
-        <w:rPr>
-          <w:rFonts w:ascii="Times New Roman" w:hAnsi="Times New Roman"/>
-          <w:sz w:val="24"/>
-        </w:rPr>
-        <w:t>Temperature</w:t>
-      </w:r>
-      <w:proofErr w:type="spellEnd"/>
-      <w:r>
-        <w:rPr>
-          <w:rFonts w:ascii="Times New Roman" w:hAnsi="Times New Roman"/>
-          <w:sz w:val="24"/>
-        </w:rPr>
-        <w:t>.</w:t>
-      </w:r>
-    </w:p>
-    <w:p>
-      <w:pPr>
-        <w:spacing w:after="120"/>
-        <w:ind w:firstLine="360"/>
-      </w:pPr>
-      <w:r>
-        <w:rPr>
-          <w:rFonts w:ascii="Times New Roman" w:hAnsi="Times New Roman"/>
-          <w:sz w:val="24"/>
-        </w:rPr>
-        <w:t>Obr. 13 - Screenshot konzole po vypsání teploty.</w:t>
-      </w:r>
-    </w:p>
-    <w:p>
-      <w:pPr>
-        <w:spacing w:after="120"/>
-        <w:ind w:firstLine="360"/>
-      </w:pPr>
-      <w:r>
-        <w:rPr>
-          <w:rFonts w:ascii="Times New Roman" w:hAnsi="Times New Roman"/>
-          <w:sz w:val="24"/>
-        </w:rPr>
-        <w:t>Obr. 14 - Screenshot jedné z chyb při vývoji.</w:t>
+        <w:t xml:space="preserve">Obr. </w:t>
+      </w:r>
+      <w:r>
+        <w:rPr>
+          <w:rFonts w:ascii="Times New Roman" w:hAnsi="Times New Roman"/>
+          <w:sz w:val="24"/>
+        </w:rPr>
+        <w:t>9</w:t>
+      </w:r>
+      <w:r>
+        <w:rPr>
+          <w:rFonts w:ascii="Times New Roman" w:hAnsi="Times New Roman"/>
+          <w:sz w:val="24"/>
+        </w:rPr>
+        <w:t xml:space="preserve"> - Screenshot konzole po vypsání teploty.</w:t>
       </w:r>
     </w:p>
     <w:p>
@@ -10200,10 +10394,10 @@
       </w:r>
     </w:p>
     <w:sectPr>
-      <w:headerReference w:type="even" r:id="rId14"/>
-      <w:headerReference w:type="default" r:id="rId15"/>
-      <w:footerReference w:type="default" r:id="rId16"/>
-      <w:headerReference w:type="first" r:id="rId17"/>
+      <w:headerReference w:type="even" r:id="rId24"/>
+      <w:headerReference w:type="default" r:id="rId25"/>
+      <w:footerReference w:type="default" r:id="rId26"/>
+      <w:headerReference w:type="first" r:id="rId27"/>
       <w:pgSz w:w="11906" w:h="16838"/>
       <w:pgMar w:top="1152" w:right="1080" w:bottom="1152" w:left="1080" w:header="680" w:footer="680" w:gutter="0"/>
       <w:cols w:space="708"/>
@@ -14612,6 +14806,18 @@
       <w:ind w:left="220"/>
     </w:pPr>
   </w:style>
+  <w:style w:type="character" w:styleId="Nevyeenzmnka">
+    <w:name w:val="Unresolved Mention"/>
+    <w:basedOn w:val="Standardnpsmoodstavce"/>
+    <w:uiPriority w:val="99"/>
+    <w:semiHidden/>
+    <w:unhideWhenUsed/>
+    <w:rsid w:val="005D081E"/>
+    <w:rPr>
+      <w:color w:val="605E5C"/>
+      <w:shd w:val="clear" w:color="auto" w:fill="E1DFDD"/>
+    </w:rPr>
+  </w:style>
 </w:styles>
 </file>
 
@@ -14911,6 +15117,10 @@
 </file>
 
 <file path=customXml/item1.xml><?xml version="1.0" encoding="utf-8"?>
+<b:Sources xmlns:b="http://schemas.openxmlformats.org/officeDocument/2006/bibliography" xmlns="http://schemas.openxmlformats.org/officeDocument/2006/bibliography" SelectedStyle="\APASixthEditionOfficeOnline.xsl" StyleName="APA" Version="6"/>
+</file>
+
+<file path=customXml/item2.xml><?xml version="1.0" encoding="utf-8"?>
 <ct:contentTypeSchema xmlns:ct="http://schemas.microsoft.com/office/2006/metadata/contentType" xmlns:ma="http://schemas.microsoft.com/office/2006/metadata/properties/metaAttributes" ct:_="" ma:_="" ma:contentTypeName="Dokument" ma:contentTypeID="0x0101007AC253A931DA3842A9467F19871E2C1B" ma:contentTypeVersion="10" ma:contentTypeDescription="Vytvoří nový dokument" ma:contentTypeScope="" ma:versionID="9dbcdc17d608927f05e31a50324249a7">
   <xsd:schema xmlns:xsd="http://www.w3.org/2001/XMLSchema" xmlns:xs="http://www.w3.org/2001/XMLSchema" xmlns:p="http://schemas.microsoft.com/office/2006/metadata/properties" xmlns:ns2="ac4d9f64-92e6-40df-bbe5-cbf691cfe8ae" xmlns:ns3="9069f8e3-06b5-4841-af59-bd496f6fbcdc" targetNamespace="http://schemas.microsoft.com/office/2006/metadata/properties" ma:root="true" ma:fieldsID="fb3d1d1e590abe5f5a4ef74e9b43408f" ns2:_="" ns3:_="">
     <xsd:import namespace="ac4d9f64-92e6-40df-bbe5-cbf691cfe8ae"/>
@@ -15099,11 +15309,16 @@
 </ct:contentTypeSchema>
 </file>
 
-<file path=customXml/item2.xml><?xml version="1.0" encoding="utf-8"?>
-<b:Sources xmlns:b="http://schemas.openxmlformats.org/officeDocument/2006/bibliography" xmlns="http://schemas.openxmlformats.org/officeDocument/2006/bibliography" SelectedStyle="\APASixthEditionOfficeOnline.xsl" StyleName="APA" Version="6"/>
+<file path=customXml/item3.xml><?xml version="1.0" encoding="utf-8"?>
+<?mso-contentType ?>
+<FormTemplates xmlns="http://schemas.microsoft.com/sharepoint/v3/contenttype/forms">
+  <Display>DocumentLibraryForm</Display>
+  <Edit>DocumentLibraryForm</Edit>
+  <New>DocumentLibraryForm</New>
+</FormTemplates>
 </file>
 
-<file path=customXml/item3.xml><?xml version="1.0" encoding="utf-8"?>
+<file path=customXml/item4.xml><?xml version="1.0" encoding="utf-8"?>
 <p:properties xmlns:p="http://schemas.microsoft.com/office/2006/metadata/properties" xmlns:xsi="http://www.w3.org/2001/XMLSchema-instance" xmlns:pc="http://schemas.microsoft.com/office/infopath/2007/PartnerControls">
   <documentManagement>
     <TaxCatchAll xmlns="9069f8e3-06b5-4841-af59-bd496f6fbcdc" xsi:nil="true"/>
@@ -15114,16 +15329,15 @@
 </p:properties>
 </file>
 
-<file path=customXml/item4.xml><?xml version="1.0" encoding="utf-8"?>
-<?mso-contentType ?>
-<FormTemplates xmlns="http://schemas.microsoft.com/sharepoint/v3/contenttype/forms">
-  <Display>DocumentLibraryForm</Display>
-  <Edit>DocumentLibraryForm</Edit>
-  <New>DocumentLibraryForm</New>
-</FormTemplates>
+<file path=customXml/itemProps1.xml><?xml version="1.0" encoding="utf-8"?>
+<ds:datastoreItem xmlns:ds="http://schemas.openxmlformats.org/officeDocument/2006/customXml" ds:itemID="{E0BB6427-4419-4C21-A0DF-4471F23995B6}">
+  <ds:schemaRefs>
+    <ds:schemaRef ds:uri="http://schemas.openxmlformats.org/officeDocument/2006/bibliography"/>
+  </ds:schemaRefs>
+</ds:datastoreItem>
 </file>
 
-<file path=customXml/itemProps1.xml><?xml version="1.0" encoding="utf-8"?>
+<file path=customXml/itemProps2.xml><?xml version="1.0" encoding="utf-8"?>
 <ds:datastoreItem xmlns:ds="http://schemas.openxmlformats.org/officeDocument/2006/customXml" ds:itemID="{D5874249-D0BB-47A2-ADCE-DE87B2259BE8}">
   <ds:schemaRefs>
     <ds:schemaRef ds:uri="http://schemas.microsoft.com/office/2006/metadata/contentType"/>
@@ -15142,15 +15356,15 @@
 </ds:datastoreItem>
 </file>
 
-<file path=customXml/itemProps2.xml><?xml version="1.0" encoding="utf-8"?>
-<ds:datastoreItem xmlns:ds="http://schemas.openxmlformats.org/officeDocument/2006/customXml" ds:itemID="{E0BB6427-4419-4C21-A0DF-4471F23995B6}">
+<file path=customXml/itemProps3.xml><?xml version="1.0" encoding="utf-8"?>
+<ds:datastoreItem xmlns:ds="http://schemas.openxmlformats.org/officeDocument/2006/customXml" ds:itemID="{E8FDF9F9-0BC5-4BD9-96CC-E3BC62E19A62}">
   <ds:schemaRefs>
-    <ds:schemaRef ds:uri="http://schemas.openxmlformats.org/officeDocument/2006/bibliography"/>
+    <ds:schemaRef ds:uri="http://schemas.microsoft.com/sharepoint/v3/contenttype/forms"/>
   </ds:schemaRefs>
 </ds:datastoreItem>
 </file>
 
-<file path=customXml/itemProps3.xml><?xml version="1.0" encoding="utf-8"?>
+<file path=customXml/itemProps4.xml><?xml version="1.0" encoding="utf-8"?>
 <ds:datastoreItem xmlns:ds="http://schemas.openxmlformats.org/officeDocument/2006/customXml" ds:itemID="{FB1D83C0-C8CC-4C35-B0E6-D4B15A08C6B5}">
   <ds:schemaRefs>
     <ds:schemaRef ds:uri="http://schemas.microsoft.com/office/2006/metadata/properties"/>
@@ -15159,12 +15373,4 @@
     <ds:schemaRef ds:uri="ac4d9f64-92e6-40df-bbe5-cbf691cfe8ae"/>
   </ds:schemaRefs>
 </ds:datastoreItem>
-</file>
-
-<file path=customXml/itemProps4.xml><?xml version="1.0" encoding="utf-8"?>
-<ds:datastoreItem xmlns:ds="http://schemas.openxmlformats.org/officeDocument/2006/customXml" ds:itemID="{E8FDF9F9-0BC5-4BD9-96CC-E3BC62E19A62}">
-  <ds:schemaRefs>
-    <ds:schemaRef ds:uri="http://schemas.microsoft.com/sharepoint/v3/contenttype/forms"/>
-  </ds:schemaRefs>
-</ds:datastoreItem>
 </file>
</xml_diff>